<commit_message>
Sarcina tehnica actualizata si raport de progres
Sarcina Tehnica.docx — trei completari, restul documentului neatins:
- prezentarea generala spune acum ca datele vin din baza de date, iar fisierele
  JSON se citesc/scriu direct pe file server prin SFTP, fara fisiere locale
- Backend: punct nou pentru clientul de file server prin SFTP (listare, citire,
  descarcare, incarcare, modificare, cu backup inainte de suprascriere)
- Tester: punct nou pentru testarea accesului la file server de pe alt calculator

raport.docx — raport de progres in 7 secțiuni: rezumat, baza de date, file server,
acces la distanta cu tabelul testelor, aplicatia, deciziile tehnice luate pe
parcurs si ce ramane de facut.
</commit_message>
<xml_diff>
--- a/Sarcina Tehnica.docx
+++ b/Sarcina Tehnica.docx
@@ -37,7 +37,7 @@
         <w:spacing w:after="160"/>
       </w:pPr>
       <w:r>
-        <w:t xml:space="preserve">Aplicație desktop pentru gestionarea unei autogări: vânzare bilete, gestionare curse/rute, autobuze și șoferi, cu alocare vizuală a locurilor și o hartă proprie a stațiilor. Laptopul rulează aplicația (client); un computer de acasă funcționează ca server (MS SQL Server + file server), accesibil de la distanță prin port-forwarding. Model de lucru: waterfall — fiecare etapă se finalizează complet înainte de a trece mai departe.</w:t>
+        <w:t xml:space="preserve">Aplicație desktop pentru gestionarea unei autogări: vânzare bilete, gestionare curse/rute, autobuze și șoferi, cu alocare vizuală a locurilor și o hartă proprie a stațiilor. Laptopul rulează aplicația (client); un computer de acasă funcționează ca server (MS SQL Server + file server), accesibil de la distanță prin port-forwarding. Datele vin din baza de date, iar fișierele JSON se citesc și se scriu direct pe file server prin SFTP; stațiile de lucru nu folosesc fișiere locale. Model de lucru: waterfall — fiecare etapă se finalizează complet înainte de a trece mai departe.</w:t>
       </w:r>
     </w:p>
     <w:p>
@@ -258,6 +258,19 @@
         <w:spacing w:after="60"/>
       </w:pPr>
       <w:r>
+        <w:t xml:space="preserve">Implementează clientul de file server prin SFTP: listare, citire, descărcare, încărcare și modificare a fișierelor de pe server, cu backup al versiunii anterioare înainte de suprascriere</w:t>
+      </w:r>
+    </w:p>
+    <w:p>
+      <w:pPr>
+        <w:pStyle w:val="ListParagraph"/>
+        <w:numPr>
+          <w:ilvl w:val="0"/>
+          <w:numId w:val="3"/>
+        </w:numPr>
+        <w:spacing w:after="60"/>
+      </w:pPr>
+      <w:r>
         <w:t xml:space="preserve">Implementează logica de rezervare, vânzare, anulare și rambursare bilete</w:t>
       </w:r>
     </w:p>
@@ -511,6 +524,19 @@
       </w:pPr>
       <w:r>
         <w:t xml:space="preserve">Testează conexiunea la distanță și comportamentul în mod offline</w:t>
+      </w:r>
+    </w:p>
+    <w:p>
+      <w:pPr>
+        <w:pStyle w:val="ListParagraph"/>
+        <w:numPr>
+          <w:ilvl w:val="0"/>
+          <w:numId w:val="5"/>
+        </w:numPr>
+        <w:spacing w:after="60"/>
+      </w:pPr>
+      <w:r>
+        <w:t xml:space="preserve">Testează accesul la file server de pe alt calculator: citirea, descărcarea și modificarea fișierelor JSON prin SFTP</w:t>
       </w:r>
     </w:p>
     <w:p>

</xml_diff>